<commit_message>
test(docx): add embedded image to legal fixture for image-chunk E2E
Was 36986 bytes (text + table only). Now 38684 bytes: title + body paras
+ "Exhibit B" heading + 200x120 embedded PNG + caption + "Schedule A"
heading + 3-row table + closer. Generated via python-docx + Pillow.

Confirmed E2E with scripts/inspect_docx_chunks.py against doc_id
9b9f4ebdd163 (3 chunks: 0=image, 1=table, 2=text). All three markers
land in the DOM with correct tag (span/div/div), correct
data-chunk-type, and chunk-active class. Image wraps an <img>, table
wraps a <table>, text wraps two <p> via the new <div> fallback path.

Visual note: text highlight (border-left + tinted background) renders
clearly; table/image render as a thin border-left bar beside the
element rather than a full box. Working but subtle — polish for
later if we want chunk markers around images/tables to be more
prominent.

Co-Authored-By: Claude Opus 4.7 (1M context) <noreply@anthropic.com>
</commit_message>
<xml_diff>
--- a/tests/fixtures/docx_viewer/sample_legal.docx
+++ b/tests/fixtures/docx_viewer/sample_legal.docx
@@ -18,6 +18,55 @@
     <w:p>
       <w:r>
         <w:t>The defendant denied all allegations and counter-claimed for defamation.</w:t>
+      </w:r>
+    </w:p>
+    <w:p>
+      <w:pPr>
+        <w:pStyle w:val="Heading1"/>
+      </w:pPr>
+      <w:r>
+        <w:t>Exhibit B: Evidence Photo</w:t>
+      </w:r>
+    </w:p>
+    <w:p>
+      <w:r>
+        <w:drawing>
+          <wp:inline xmlns:a="http://schemas.openxmlformats.org/drawingml/2006/main" xmlns:pic="http://schemas.openxmlformats.org/drawingml/2006/picture">
+            <wp:extent cx="1371600" cy="822960"/>
+            <wp:docPr id="1" name="Picture 1"/>
+            <wp:cNvGraphicFramePr>
+              <a:graphicFrameLocks noChangeAspect="1"/>
+            </wp:cNvGraphicFramePr>
+            <a:graphic>
+              <a:graphicData uri="http://schemas.openxmlformats.org/drawingml/2006/picture">
+                <pic:pic>
+                  <pic:nvPicPr>
+                    <pic:cNvPr id="0" name="_blue_sample.png"/>
+                    <pic:cNvPicPr/>
+                  </pic:nvPicPr>
+                  <pic:blipFill>
+                    <a:blip r:embed="rId9"/>
+                    <a:stretch>
+                      <a:fillRect/>
+                    </a:stretch>
+                  </pic:blipFill>
+                  <pic:spPr>
+                    <a:xfrm>
+                      <a:off x="0" y="0"/>
+                      <a:ext cx="1371600" cy="822960"/>
+                    </a:xfrm>
+                    <a:prstGeom prst="rect"/>
+                  </pic:spPr>
+                </pic:pic>
+              </a:graphicData>
+            </a:graphic>
+          </wp:inline>
+        </w:drawing>
+      </w:r>
+    </w:p>
+    <w:p>
+      <w:r>
+        <w:t>Figure 1: Photograph submitted as Exhibit B.</w:t>
       </w:r>
     </w:p>
     <w:p>

</xml_diff>